<commit_message>
Implenting CU-CORE-03 – Gestión de planes-features
</commit_message>
<xml_diff>
--- a/docs/product/Casos de Uso/CU-CORE-03 – Gestión de planes-features.docx
+++ b/docs/product/Casos de Uso/CU-CORE-03 – Gestión de planes-features.docx
@@ -18,7 +18,6 @@
           <w:szCs w:val="40"/>
         </w:rPr>
       </w:pPr>
-      <w:proofErr w:type="spellStart"/>
       <w:r>
         <w:rPr>
           <w:rFonts w:asciiTheme="majorHAnsi" w:eastAsiaTheme="majorEastAsia" w:hAnsiTheme="majorHAnsi" w:cstheme="majorBidi"/>
@@ -26,9 +25,26 @@
           <w:sz w:val="40"/>
           <w:szCs w:val="40"/>
         </w:rPr>
-        <w:t>AthletIQ</w:t>
-      </w:r>
-      <w:proofErr w:type="spellEnd"/>
+        <w:t xml:space="preserve">AthletIQ – </w:t>
+      </w:r>
+      <w:r>
+        <w:rPr>
+          <w:rFonts w:asciiTheme="majorHAnsi" w:eastAsiaTheme="majorEastAsia" w:hAnsiTheme="majorHAnsi" w:cstheme="majorBidi"/>
+          <w:color w:val="2F5496" w:themeColor="accent1" w:themeShade="BF"/>
+          <w:sz w:val="40"/>
+          <w:szCs w:val="40"/>
+        </w:rPr>
+        <w:t>CU-CORE-0</w:t>
+      </w:r>
+      <w:r>
+        <w:rPr>
+          <w:rFonts w:asciiTheme="majorHAnsi" w:eastAsiaTheme="majorEastAsia" w:hAnsiTheme="majorHAnsi" w:cstheme="majorBidi"/>
+          <w:color w:val="2F5496" w:themeColor="accent1" w:themeShade="BF"/>
+          <w:sz w:val="40"/>
+          <w:szCs w:val="40"/>
+        </w:rPr>
+        <w:t>3</w:t>
+      </w:r>
       <w:r>
         <w:rPr>
           <w:rFonts w:asciiTheme="majorHAnsi" w:eastAsiaTheme="majorEastAsia" w:hAnsiTheme="majorHAnsi" w:cstheme="majorBidi"/>
@@ -45,7 +61,7 @@
           <w:sz w:val="40"/>
           <w:szCs w:val="40"/>
         </w:rPr>
-        <w:t>CU-CORE-0</w:t>
+        <w:t>Gestión de plane</w:t>
       </w:r>
       <w:r>
         <w:rPr>
@@ -54,71 +70,24 @@
           <w:sz w:val="40"/>
           <w:szCs w:val="40"/>
         </w:rPr>
-        <w:t>3</w:t>
-      </w:r>
-      <w:r>
+        <w:t>s, features y accesos</w:t>
+      </w:r>
+    </w:p>
+    <w:p>
+      <w:r>
+        <w:pict w14:anchorId="2DE79D13">
+          <v:rect id="_x0000_i1025" style="width:0;height:1.5pt" o:hralign="center" o:hrstd="t" o:hr="t" fillcolor="#a0a0a0" stroked="f"/>
+        </w:pict>
+      </w:r>
+    </w:p>
+    <w:p>
+      <w:pPr>
         <w:rPr>
           <w:rFonts w:asciiTheme="majorHAnsi" w:eastAsiaTheme="majorEastAsia" w:hAnsiTheme="majorHAnsi" w:cstheme="majorBidi"/>
           <w:color w:val="2F5496" w:themeColor="accent1" w:themeShade="BF"/>
           <w:sz w:val="40"/>
           <w:szCs w:val="40"/>
         </w:rPr>
-        <w:t xml:space="preserve"> – </w:t>
-      </w:r>
-      <w:r>
-        <w:rPr>
-          <w:rFonts w:asciiTheme="majorHAnsi" w:eastAsiaTheme="majorEastAsia" w:hAnsiTheme="majorHAnsi" w:cstheme="majorBidi"/>
-          <w:color w:val="2F5496" w:themeColor="accent1" w:themeShade="BF"/>
-          <w:sz w:val="40"/>
-          <w:szCs w:val="40"/>
-        </w:rPr>
-        <w:t>Gestión de plane</w:t>
-      </w:r>
-      <w:r>
-        <w:rPr>
-          <w:rFonts w:asciiTheme="majorHAnsi" w:eastAsiaTheme="majorEastAsia" w:hAnsiTheme="majorHAnsi" w:cstheme="majorBidi"/>
-          <w:color w:val="2F5496" w:themeColor="accent1" w:themeShade="BF"/>
-          <w:sz w:val="40"/>
-          <w:szCs w:val="40"/>
-        </w:rPr>
-        <w:t xml:space="preserve">s, </w:t>
-      </w:r>
-      <w:proofErr w:type="spellStart"/>
-      <w:r>
-        <w:rPr>
-          <w:rFonts w:asciiTheme="majorHAnsi" w:eastAsiaTheme="majorEastAsia" w:hAnsiTheme="majorHAnsi" w:cstheme="majorBidi"/>
-          <w:color w:val="2F5496" w:themeColor="accent1" w:themeShade="BF"/>
-          <w:sz w:val="40"/>
-          <w:szCs w:val="40"/>
-        </w:rPr>
-        <w:t>features</w:t>
-      </w:r>
-      <w:proofErr w:type="spellEnd"/>
-      <w:r>
-        <w:rPr>
-          <w:rFonts w:asciiTheme="majorHAnsi" w:eastAsiaTheme="majorEastAsia" w:hAnsiTheme="majorHAnsi" w:cstheme="majorBidi"/>
-          <w:color w:val="2F5496" w:themeColor="accent1" w:themeShade="BF"/>
-          <w:sz w:val="40"/>
-          <w:szCs w:val="40"/>
-        </w:rPr>
-        <w:t xml:space="preserve"> y accesos</w:t>
-      </w:r>
-    </w:p>
-    <w:p>
-      <w:r>
-        <w:pict w14:anchorId="2DE79D13">
-          <v:rect id="_x0000_i1289" style="width:0;height:1.5pt" o:hralign="center" o:hrstd="t" o:hr="t" fillcolor="#a0a0a0" stroked="f"/>
-        </w:pict>
-      </w:r>
-    </w:p>
-    <w:p>
-      <w:pPr>
-        <w:rPr>
-          <w:rFonts w:asciiTheme="majorHAnsi" w:eastAsiaTheme="majorEastAsia" w:hAnsiTheme="majorHAnsi" w:cstheme="majorBidi"/>
-          <w:color w:val="2F5496" w:themeColor="accent1" w:themeShade="BF"/>
-          <w:sz w:val="40"/>
-          <w:szCs w:val="40"/>
-        </w:rPr>
       </w:pPr>
     </w:p>
     <w:p>
@@ -169,15 +138,7 @@
         <w:t>Nombre:</w:t>
       </w:r>
       <w:r>
-        <w:t xml:space="preserve"> Gestión de planes, </w:t>
-      </w:r>
-      <w:proofErr w:type="spellStart"/>
-      <w:r>
-        <w:t>features</w:t>
-      </w:r>
-      <w:proofErr w:type="spellEnd"/>
-      <w:r>
-        <w:t xml:space="preserve"> y accesos</w:t>
+        <w:t xml:space="preserve"> Gestión de planes, features y accesos</w:t>
       </w:r>
     </w:p>
     <w:p>
@@ -195,15 +156,7 @@
         <w:t>Módulo:</w:t>
       </w:r>
       <w:r>
-        <w:t xml:space="preserve"> </w:t>
-      </w:r>
-      <w:proofErr w:type="spellStart"/>
-      <w:r>
-        <w:t>AthletIQ</w:t>
-      </w:r>
-      <w:proofErr w:type="spellEnd"/>
-      <w:r>
-        <w:t xml:space="preserve"> Core</w:t>
+        <w:t xml:space="preserve"> AthletIQ Core</w:t>
       </w:r>
     </w:p>
     <w:p>
@@ -250,7 +203,7 @@
     <w:p>
       <w:r>
         <w:pict w14:anchorId="60A846B4">
-          <v:rect id="_x0000_i1235" style="width:0;height:1.5pt" o:hralign="center" o:hrstd="t" o:hr="t" fillcolor="#a0a0a0" stroked="f"/>
+          <v:rect id="_x0000_i1026" style="width:0;height:1.5pt" o:hralign="center" o:hrstd="t" o:hr="t" fillcolor="#a0a0a0" stroked="f"/>
         </w:pict>
       </w:r>
     </w:p>
@@ -272,35 +225,19 @@
     </w:p>
     <w:p>
       <w:r>
-        <w:t>Este caso de uso permite definir y administrar los planes del sistema, así como las funcionalidades (</w:t>
-      </w:r>
-      <w:proofErr w:type="spellStart"/>
-      <w:r>
-        <w:t>features</w:t>
-      </w:r>
-      <w:proofErr w:type="spellEnd"/>
-      <w:r>
-        <w:t>), módulos y formularios que estarán disponibles para los usuarios según su suscripción.</w:t>
-      </w:r>
-    </w:p>
-    <w:p>
-      <w:r>
-        <w:t xml:space="preserve">Es la base del modelo SaaS de </w:t>
-      </w:r>
-      <w:proofErr w:type="spellStart"/>
-      <w:r>
-        <w:t>AthletIQ</w:t>
-      </w:r>
-      <w:proofErr w:type="spellEnd"/>
-      <w:r>
-        <w:t xml:space="preserve"> y controla qué puede ver y hacer cada usuario en la plataforma.</w:t>
+        <w:t>Este caso de uso permite definir y administrar los planes del sistema, así como las funcionalidades (features), módulos y formularios que estarán disponibles para los usuarios según su suscripción.</w:t>
+      </w:r>
+    </w:p>
+    <w:p>
+      <w:r>
+        <w:t>Es la base del modelo SaaS de AthletIQ y controla qué puede ver y hacer cada usuario en la plataforma.</w:t>
       </w:r>
     </w:p>
     <w:p/>
     <w:p>
       <w:r>
         <w:pict w14:anchorId="32AD5DEE">
-          <v:rect id="_x0000_i1236" style="width:0;height:1.5pt" o:hralign="center" o:hrstd="t" o:hr="t" fillcolor="#a0a0a0" stroked="f"/>
+          <v:rect id="_x0000_i1027" style="width:0;height:1.5pt" o:hralign="center" o:hrstd="t" o:hr="t" fillcolor="#a0a0a0" stroked="f"/>
         </w:pict>
       </w:r>
     </w:p>
@@ -353,15 +290,7 @@
         <w:t>Secundario:</w:t>
       </w:r>
       <w:r>
-        <w:t xml:space="preserve"> Sistema </w:t>
-      </w:r>
-      <w:proofErr w:type="spellStart"/>
-      <w:r>
-        <w:t>AthletIQ</w:t>
-      </w:r>
-      <w:proofErr w:type="spellEnd"/>
-      <w:r>
-        <w:t xml:space="preserve"> Core</w:t>
+        <w:t xml:space="preserve"> Sistema AthletIQ Core</w:t>
       </w:r>
     </w:p>
     <w:p>
@@ -379,15 +308,7 @@
         <w:t>Consumidores:</w:t>
       </w:r>
       <w:r>
-        <w:t xml:space="preserve"> Todos los módulos (Train, Arena, </w:t>
-      </w:r>
-      <w:proofErr w:type="spellStart"/>
-      <w:r>
-        <w:t>Events</w:t>
-      </w:r>
-      <w:proofErr w:type="spellEnd"/>
-      <w:r>
-        <w:t>)</w:t>
+        <w:t xml:space="preserve"> Todos los módulos (Train, Arena, Events)</w:t>
       </w:r>
     </w:p>
     <w:p>
@@ -401,7 +322,7 @@
     <w:p>
       <w:r>
         <w:pict w14:anchorId="3FF93493">
-          <v:rect id="_x0000_i1237" style="width:0;height:1.5pt" o:hralign="center" o:hrstd="t" o:hr="t" fillcolor="#a0a0a0" stroked="f"/>
+          <v:rect id="_x0000_i1028" style="width:0;height:1.5pt" o:hralign="center" o:hrstd="t" o:hr="t" fillcolor="#a0a0a0" stroked="f"/>
         </w:pict>
       </w:r>
     </w:p>
@@ -451,15 +372,7 @@
         </w:numPr>
       </w:pPr>
       <w:r>
-        <w:t xml:space="preserve">Deben existir </w:t>
-      </w:r>
-      <w:proofErr w:type="spellStart"/>
-      <w:r>
-        <w:t>features</w:t>
-      </w:r>
-      <w:proofErr w:type="spellEnd"/>
-      <w:r>
-        <w:t>, módulos y formularios definidos</w:t>
+        <w:t>Deben existir features, módulos y formularios definidos</w:t>
       </w:r>
     </w:p>
     <w:p>
@@ -470,7 +383,7 @@
     <w:p>
       <w:r>
         <w:pict w14:anchorId="5662BF52">
-          <v:rect id="_x0000_i1238" style="width:0;height:1.5pt" o:hralign="center" o:hrstd="t" o:hr="t" fillcolor="#a0a0a0" stroked="f"/>
+          <v:rect id="_x0000_i1029" style="width:0;height:1.5pt" o:hralign="center" o:hrstd="t" o:hr="t" fillcolor="#a0a0a0" stroked="f"/>
         </w:pict>
       </w:r>
     </w:p>
@@ -509,15 +422,7 @@
         </w:numPr>
       </w:pPr>
       <w:r>
-        <w:t xml:space="preserve">Se asignan </w:t>
-      </w:r>
-      <w:proofErr w:type="spellStart"/>
-      <w:r>
-        <w:t>features</w:t>
-      </w:r>
-      <w:proofErr w:type="spellEnd"/>
-      <w:r>
-        <w:t xml:space="preserve"> a los planes</w:t>
+        <w:t>Se asignan features a los planes</w:t>
       </w:r>
     </w:p>
     <w:p>
@@ -565,7 +470,7 @@
     <w:p>
       <w:r>
         <w:pict w14:anchorId="2552976A">
-          <v:rect id="_x0000_i1239" style="width:0;height:1.5pt" o:hralign="center" o:hrstd="t" o:hr="t" fillcolor="#a0a0a0" stroked="f"/>
+          <v:rect id="_x0000_i1030" style="width:0;height:1.5pt" o:hralign="center" o:hrstd="t" o:hr="t" fillcolor="#a0a0a0" stroked="f"/>
         </w:pict>
       </w:r>
     </w:p>
@@ -587,7 +492,7 @@
     <w:p>
       <w:r>
         <w:pict w14:anchorId="6C878330">
-          <v:rect id="_x0000_i1240" style="width:0;height:1.5pt" o:hralign="center" o:hrstd="t" o:hr="t" fillcolor="#a0a0a0" stroked="f"/>
+          <v:rect id="_x0000_i1031" style="width:0;height:1.5pt" o:hralign="center" o:hrstd="t" o:hr="t" fillcolor="#a0a0a0" stroked="f"/>
         </w:pict>
       </w:r>
     </w:p>
@@ -687,7 +592,7 @@
     <w:p>
       <w:r>
         <w:pict w14:anchorId="25C0C5CB">
-          <v:rect id="_x0000_i1241" style="width:0;height:1.5pt" o:hralign="center" o:hrstd="t" o:hr="t" fillcolor="#a0a0a0" stroked="f"/>
+          <v:rect id="_x0000_i1032" style="width:0;height:1.5pt" o:hralign="center" o:hrstd="t" o:hr="t" fillcolor="#a0a0a0" stroked="f"/>
         </w:pict>
       </w:r>
     </w:p>
@@ -704,17 +609,179 @@
           <w:b/>
           <w:bCs/>
         </w:rPr>
-        <w:t xml:space="preserve">B. Configuración de </w:t>
-      </w:r>
-      <w:proofErr w:type="spellStart"/>
+        <w:t xml:space="preserve">B. </w:t>
+      </w:r>
       <w:r>
         <w:rPr>
           <w:b/>
           <w:bCs/>
         </w:rPr>
-        <w:t>features</w:t>
-      </w:r>
-      <w:proofErr w:type="spellEnd"/>
+        <w:t xml:space="preserve"> Creacion de Features</w:t>
+      </w:r>
+    </w:p>
+    <w:p>
+      <w:pPr>
+        <w:pStyle w:val="Prrafodelista"/>
+        <w:numPr>
+          <w:ilvl w:val="0"/>
+          <w:numId w:val="69"/>
+        </w:numPr>
+        <w:rPr>
+          <w:b/>
+          <w:bCs/>
+        </w:rPr>
+      </w:pPr>
+      <w:r>
+        <w:t>El administrador accede a gestión de features</w:t>
+      </w:r>
+    </w:p>
+    <w:p>
+      <w:pPr>
+        <w:pStyle w:val="Prrafodelista"/>
+        <w:numPr>
+          <w:ilvl w:val="0"/>
+          <w:numId w:val="69"/>
+        </w:numPr>
+        <w:rPr>
+          <w:b/>
+          <w:bCs/>
+        </w:rPr>
+      </w:pPr>
+      <w:r>
+        <w:t>El sistema muestra features existtentes</w:t>
+      </w:r>
+    </w:p>
+    <w:p>
+      <w:pPr>
+        <w:pStyle w:val="Prrafodelista"/>
+        <w:numPr>
+          <w:ilvl w:val="0"/>
+          <w:numId w:val="69"/>
+        </w:numPr>
+        <w:rPr>
+          <w:b/>
+          <w:bCs/>
+        </w:rPr>
+      </w:pPr>
+      <w:r>
+        <w:t>El administrador crea una nueva feture</w:t>
+      </w:r>
+    </w:p>
+    <w:p>
+      <w:pPr>
+        <w:pStyle w:val="Prrafodelista"/>
+        <w:numPr>
+          <w:ilvl w:val="0"/>
+          <w:numId w:val="69"/>
+        </w:numPr>
+        <w:rPr>
+          <w:b/>
+          <w:bCs/>
+        </w:rPr>
+      </w:pPr>
+      <w:r>
+        <w:t>Define:</w:t>
+      </w:r>
+    </w:p>
+    <w:p>
+      <w:pPr>
+        <w:pStyle w:val="Prrafodelista"/>
+        <w:numPr>
+          <w:ilvl w:val="0"/>
+          <w:numId w:val="70"/>
+        </w:numPr>
+        <w:rPr>
+          <w:b/>
+          <w:bCs/>
+        </w:rPr>
+      </w:pPr>
+      <w:r>
+        <w:t>Name</w:t>
+      </w:r>
+    </w:p>
+    <w:p>
+      <w:pPr>
+        <w:pStyle w:val="Prrafodelista"/>
+        <w:numPr>
+          <w:ilvl w:val="0"/>
+          <w:numId w:val="70"/>
+        </w:numPr>
+        <w:rPr>
+          <w:b/>
+          <w:bCs/>
+        </w:rPr>
+      </w:pPr>
+      <w:r>
+        <w:t>Código</w:t>
+      </w:r>
+    </w:p>
+    <w:p>
+      <w:pPr>
+        <w:pStyle w:val="Prrafodelista"/>
+        <w:numPr>
+          <w:ilvl w:val="0"/>
+          <w:numId w:val="70"/>
+        </w:numPr>
+        <w:rPr>
+          <w:b/>
+          <w:bCs/>
+        </w:rPr>
+      </w:pPr>
+      <w:r>
+        <w:t>Modulo</w:t>
+      </w:r>
+    </w:p>
+    <w:p>
+      <w:pPr>
+        <w:pStyle w:val="Prrafodelista"/>
+        <w:numPr>
+          <w:ilvl w:val="0"/>
+          <w:numId w:val="69"/>
+        </w:numPr>
+        <w:rPr>
+          <w:b/>
+          <w:bCs/>
+        </w:rPr>
+      </w:pPr>
+      <w:r>
+        <w:t>El sistema guarda la feature</w:t>
+      </w:r>
+    </w:p>
+    <w:p>
+      <w:pPr>
+        <w:rPr>
+          <w:b/>
+          <w:bCs/>
+        </w:rPr>
+      </w:pPr>
+      <w:r>
+        <w:pict w14:anchorId="31511D72">
+          <v:rect id="_x0000_i1053" style="width:0;height:1.5pt" o:hralign="center" o:hrstd="t" o:hr="t" fillcolor="#a0a0a0" stroked="f"/>
+        </w:pict>
+      </w:r>
+    </w:p>
+    <w:p/>
+    <w:p>
+      <w:pPr>
+        <w:rPr>
+          <w:b/>
+          <w:bCs/>
+        </w:rPr>
+      </w:pPr>
+      <w:r>
+        <w:rPr>
+          <w:b/>
+          <w:bCs/>
+        </w:rPr>
+        <w:t>C</w:t>
+      </w:r>
+      <w:r>
+        <w:rPr>
+          <w:b/>
+          <w:bCs/>
+        </w:rPr>
+        <w:t>. Configuración de features</w:t>
+      </w:r>
     </w:p>
     <w:p>
       <w:pPr>
@@ -735,15 +802,7 @@
         </w:numPr>
       </w:pPr>
       <w:r>
-        <w:t xml:space="preserve">El sistema muestra lista de </w:t>
-      </w:r>
-      <w:proofErr w:type="spellStart"/>
-      <w:r>
-        <w:t>features</w:t>
-      </w:r>
-      <w:proofErr w:type="spellEnd"/>
-      <w:r>
-        <w:t xml:space="preserve"> disponibles</w:t>
+        <w:t>El sistema muestra lista de features disponibles</w:t>
       </w:r>
     </w:p>
     <w:p>
@@ -754,13 +813,8 @@
         </w:numPr>
       </w:pPr>
       <w:r>
-        <w:t xml:space="preserve">El administrador habilita/deshabilita </w:t>
-      </w:r>
-      <w:proofErr w:type="spellStart"/>
-      <w:r>
-        <w:t>features</w:t>
-      </w:r>
-      <w:proofErr w:type="spellEnd"/>
+        <w:t>El administrador habilita/deshabilita features</w:t>
+      </w:r>
     </w:p>
     <w:p>
       <w:pPr>
@@ -770,18 +824,13 @@
         </w:numPr>
       </w:pPr>
       <w:r>
-        <w:t xml:space="preserve">El sistema guarda configuración en </w:t>
-      </w:r>
-      <w:proofErr w:type="spellStart"/>
-      <w:r>
-        <w:t>plan_features</w:t>
-      </w:r>
-      <w:proofErr w:type="spellEnd"/>
+        <w:t>El sistema guarda configuración en plan_features</w:t>
+      </w:r>
     </w:p>
     <w:p>
       <w:r>
         <w:pict w14:anchorId="6F70D23D">
-          <v:rect id="_x0000_i1242" style="width:0;height:1.5pt" o:hralign="center" o:hrstd="t" o:hr="t" fillcolor="#a0a0a0" stroked="f"/>
+          <v:rect id="_x0000_i1033" style="width:0;height:1.5pt" o:hralign="center" o:hrstd="t" o:hr="t" fillcolor="#a0a0a0" stroked="f"/>
         </w:pict>
       </w:r>
     </w:p>
@@ -798,7 +847,14 @@
           <w:b/>
           <w:bCs/>
         </w:rPr>
-        <w:t>C. Configuración de módulos</w:t>
+        <w:t>D</w:t>
+      </w:r>
+      <w:r>
+        <w:rPr>
+          <w:b/>
+          <w:bCs/>
+        </w:rPr>
+        <w:t>. Configuración de módulos</w:t>
       </w:r>
     </w:p>
     <w:p>
@@ -820,18 +876,13 @@
         </w:numPr>
       </w:pPr>
       <w:r>
-        <w:t xml:space="preserve">El sistema guarda en </w:t>
-      </w:r>
-      <w:proofErr w:type="spellStart"/>
-      <w:r>
-        <w:t>plan_modules</w:t>
-      </w:r>
-      <w:proofErr w:type="spellEnd"/>
+        <w:t>El sistema guarda en plan_modules</w:t>
+      </w:r>
     </w:p>
     <w:p>
       <w:r>
         <w:pict w14:anchorId="563E51AA">
-          <v:rect id="_x0000_i1243" style="width:0;height:1.5pt" o:hralign="center" o:hrstd="t" o:hr="t" fillcolor="#a0a0a0" stroked="f"/>
+          <v:rect id="_x0000_i1034" style="width:0;height:1.5pt" o:hralign="center" o:hrstd="t" o:hr="t" fillcolor="#a0a0a0" stroked="f"/>
         </w:pict>
       </w:r>
     </w:p>
@@ -848,7 +899,14 @@
           <w:b/>
           <w:bCs/>
         </w:rPr>
-        <w:t>D. Configuración de formularios</w:t>
+        <w:t>F</w:t>
+      </w:r>
+      <w:r>
+        <w:rPr>
+          <w:b/>
+          <w:bCs/>
+        </w:rPr>
+        <w:t>. Configuración de formularios</w:t>
       </w:r>
     </w:p>
     <w:p>
@@ -870,18 +928,13 @@
         </w:numPr>
       </w:pPr>
       <w:r>
-        <w:t xml:space="preserve">El sistema guarda en </w:t>
-      </w:r>
-      <w:proofErr w:type="spellStart"/>
-      <w:r>
-        <w:t>plan_forms</w:t>
-      </w:r>
-      <w:proofErr w:type="spellEnd"/>
+        <w:t>El sistema guarda en plan_forms</w:t>
+      </w:r>
     </w:p>
     <w:p>
       <w:r>
         <w:pict w14:anchorId="2FCFC8FD">
-          <v:rect id="_x0000_i1244" style="width:0;height:1.5pt" o:hralign="center" o:hrstd="t" o:hr="t" fillcolor="#a0a0a0" stroked="f"/>
+          <v:rect id="_x0000_i1035" style="width:0;height:1.5pt" o:hralign="center" o:hrstd="t" o:hr="t" fillcolor="#a0a0a0" stroked="f"/>
         </w:pict>
       </w:r>
     </w:p>
@@ -918,7 +971,7 @@
     <w:p>
       <w:r>
         <w:pict w14:anchorId="515E70C5">
-          <v:rect id="_x0000_i1245" style="width:0;height:1.5pt" o:hralign="center" o:hrstd="t" o:hr="t" fillcolor="#a0a0a0" stroked="f"/>
+          <v:rect id="_x0000_i1036" style="width:0;height:1.5pt" o:hralign="center" o:hrstd="t" o:hr="t" fillcolor="#a0a0a0" stroked="f"/>
         </w:pict>
       </w:r>
     </w:p>
@@ -962,7 +1015,7 @@
     <w:p>
       <w:r>
         <w:pict w14:anchorId="2F190DC2">
-          <v:rect id="_x0000_i1246" style="width:0;height:1.5pt" o:hralign="center" o:hrstd="t" o:hr="t" fillcolor="#a0a0a0" stroked="f"/>
+          <v:rect id="_x0000_i1037" style="width:0;height:1.5pt" o:hralign="center" o:hrstd="t" o:hr="t" fillcolor="#a0a0a0" stroked="f"/>
         </w:pict>
       </w:r>
     </w:p>
@@ -1005,9 +1058,8 @@
     </w:p>
     <w:p>
       <w:r>
-        <w:lastRenderedPageBreak/>
         <w:pict w14:anchorId="6F319D4C">
-          <v:rect id="_x0000_i1247" style="width:0;height:1.5pt" o:hralign="center" o:hrstd="t" o:hr="t" fillcolor="#a0a0a0" stroked="f"/>
+          <v:rect id="_x0000_i1038" style="width:0;height:1.5pt" o:hralign="center" o:hrstd="t" o:hr="t" fillcolor="#a0a0a0" stroked="f"/>
         </w:pict>
       </w:r>
     </w:p>
@@ -1073,7 +1125,7 @@
     <w:p>
       <w:r>
         <w:pict w14:anchorId="5D6C53EF">
-          <v:rect id="_x0000_i1248" style="width:0;height:1.5pt" o:hralign="center" o:hrstd="t" o:hr="t" fillcolor="#a0a0a0" stroked="f"/>
+          <v:rect id="_x0000_i1039" style="width:0;height:1.5pt" o:hralign="center" o:hrstd="t" o:hr="t" fillcolor="#a0a0a0" stroked="f"/>
         </w:pict>
       </w:r>
     </w:p>
@@ -1112,15 +1164,7 @@
         </w:numPr>
       </w:pPr>
       <w:r>
-        <w:t xml:space="preserve">Las </w:t>
-      </w:r>
-      <w:proofErr w:type="spellStart"/>
-      <w:r>
-        <w:t>features</w:t>
-      </w:r>
-      <w:proofErr w:type="spellEnd"/>
-      <w:r>
-        <w:t xml:space="preserve"> solo aplican si el módulo está habilitado</w:t>
+        <w:t>Las features solo aplican si el módulo está habilitado</w:t>
       </w:r>
     </w:p>
     <w:p>
@@ -1141,13 +1185,8 @@
           <w:numId w:val="66"/>
         </w:numPr>
       </w:pPr>
-      <w:proofErr w:type="spellStart"/>
-      <w:r>
-        <w:t>features</w:t>
-      </w:r>
-      <w:proofErr w:type="spellEnd"/>
-      <w:r>
-        <w:t xml:space="preserve"> de su plan</w:t>
+      <w:r>
+        <w:t>features de su plan</w:t>
       </w:r>
     </w:p>
     <w:p>
@@ -1180,21 +1219,13 @@
         </w:numPr>
       </w:pPr>
       <w:r>
-        <w:t xml:space="preserve">Cambios en planes no afectan sesiones activas (hasta </w:t>
-      </w:r>
-      <w:proofErr w:type="spellStart"/>
-      <w:r>
-        <w:t>refresh</w:t>
-      </w:r>
-      <w:proofErr w:type="spellEnd"/>
-      <w:r>
-        <w:t>)</w:t>
+        <w:t>Cambios en planes no afectan sesiones activas (hasta refresh)</w:t>
       </w:r>
     </w:p>
     <w:p>
       <w:r>
         <w:pict w14:anchorId="1FDCE43F">
-          <v:rect id="_x0000_i1249" style="width:0;height:1.5pt" o:hralign="center" o:hrstd="t" o:hr="t" fillcolor="#a0a0a0" stroked="f"/>
+          <v:rect id="_x0000_i1040" style="width:0;height:1.5pt" o:hralign="center" o:hrstd="t" o:hr="t" fillcolor="#a0a0a0" stroked="f"/>
         </w:pict>
       </w:r>
     </w:p>
@@ -1231,7 +1262,7 @@
     <w:p>
       <w:r>
         <w:pict w14:anchorId="782D185B">
-          <v:rect id="_x0000_i1250" style="width:0;height:1.5pt" o:hralign="center" o:hrstd="t" o:hr="t" fillcolor="#a0a0a0" stroked="f"/>
+          <v:rect id="_x0000_i1041" style="width:0;height:1.5pt" o:hralign="center" o:hrstd="t" o:hr="t" fillcolor="#a0a0a0" stroked="f"/>
         </w:pict>
       </w:r>
     </w:p>
@@ -1274,7 +1305,7 @@
     <w:p>
       <w:r>
         <w:pict w14:anchorId="750C423B">
-          <v:rect id="_x0000_i1251" style="width:0;height:1.5pt" o:hralign="center" o:hrstd="t" o:hr="t" fillcolor="#a0a0a0" stroked="f"/>
+          <v:rect id="_x0000_i1042" style="width:0;height:1.5pt" o:hralign="center" o:hrstd="t" o:hr="t" fillcolor="#a0a0a0" stroked="f"/>
         </w:pict>
       </w:r>
     </w:p>
@@ -1298,17 +1329,8 @@
           <w:b/>
           <w:bCs/>
         </w:rPr>
-        <w:t xml:space="preserve"> HU-03.2 – Configurar </w:t>
-      </w:r>
-      <w:proofErr w:type="spellStart"/>
-      <w:r>
-        <w:rPr>
-          <w:b/>
-          <w:bCs/>
-        </w:rPr>
-        <w:t>features</w:t>
-      </w:r>
-      <w:proofErr w:type="spellEnd"/>
+        <w:t xml:space="preserve"> HU-03.2 – Configurar features</w:t>
+      </w:r>
     </w:p>
     <w:p>
       <w:r>
@@ -1326,7 +1348,7 @@
     <w:p>
       <w:r>
         <w:pict w14:anchorId="7255D647">
-          <v:rect id="_x0000_i1252" style="width:0;height:1.5pt" o:hralign="center" o:hrstd="t" o:hr="t" fillcolor="#a0a0a0" stroked="f"/>
+          <v:rect id="_x0000_i1043" style="width:0;height:1.5pt" o:hralign="center" o:hrstd="t" o:hr="t" fillcolor="#a0a0a0" stroked="f"/>
         </w:pict>
       </w:r>
     </w:p>
@@ -1355,6 +1377,7 @@
     </w:p>
     <w:p>
       <w:r>
+        <w:lastRenderedPageBreak/>
         <w:t>Como administrador</w:t>
       </w:r>
       <w:r>
@@ -1369,7 +1392,7 @@
     <w:p>
       <w:r>
         <w:pict w14:anchorId="620A63F1">
-          <v:rect id="_x0000_i1253" style="width:0;height:1.5pt" o:hralign="center" o:hrstd="t" o:hr="t" fillcolor="#a0a0a0" stroked="f"/>
+          <v:rect id="_x0000_i1044" style="width:0;height:1.5pt" o:hralign="center" o:hrstd="t" o:hr="t" fillcolor="#a0a0a0" stroked="f"/>
         </w:pict>
       </w:r>
     </w:p>
@@ -1412,7 +1435,7 @@
     <w:p>
       <w:r>
         <w:pict w14:anchorId="43A90205">
-          <v:rect id="_x0000_i1254" style="width:0;height:1.5pt" o:hralign="center" o:hrstd="t" o:hr="t" fillcolor="#a0a0a0" stroked="f"/>
+          <v:rect id="_x0000_i1045" style="width:0;height:1.5pt" o:hralign="center" o:hrstd="t" o:hr="t" fillcolor="#a0a0a0" stroked="f"/>
         </w:pict>
       </w:r>
     </w:p>
@@ -1432,7 +1455,6 @@
           <w:b/>
           <w:bCs/>
         </w:rPr>
-        <w:lastRenderedPageBreak/>
         <w:t>🧾</w:t>
       </w:r>
       <w:r>
@@ -1459,7 +1481,7 @@
     <w:p>
       <w:r>
         <w:pict w14:anchorId="45BF621E">
-          <v:rect id="_x0000_i1255" style="width:0;height:1.5pt" o:hralign="center" o:hrstd="t" o:hr="t" fillcolor="#a0a0a0" stroked="f"/>
+          <v:rect id="_x0000_i1046" style="width:0;height:1.5pt" o:hralign="center" o:hrstd="t" o:hr="t" fillcolor="#a0a0a0" stroked="f"/>
         </w:pict>
       </w:r>
     </w:p>
@@ -1496,7 +1518,7 @@
     <w:p>
       <w:r>
         <w:pict w14:anchorId="5A23ECBE">
-          <v:rect id="_x0000_i1256" style="width:0;height:1.5pt" o:hralign="center" o:hrstd="t" o:hr="t" fillcolor="#a0a0a0" stroked="f"/>
+          <v:rect id="_x0000_i1047" style="width:0;height:1.5pt" o:hralign="center" o:hrstd="t" o:hr="t" fillcolor="#a0a0a0" stroked="f"/>
         </w:pict>
       </w:r>
     </w:p>
@@ -1529,14 +1551,7 @@
       </w:r>
       <w:r>
         <w:br/>
-      </w:r>
-      <w:proofErr w:type="spellStart"/>
-      <w:r>
-        <w:t>When</w:t>
-      </w:r>
-      <w:proofErr w:type="spellEnd"/>
-      <w:r>
-        <w:t xml:space="preserve"> ingresa datos válidos</w:t>
+        <w:t>When ingresa datos válidos</w:t>
       </w:r>
       <w:r>
         <w:br/>
@@ -1546,7 +1561,7 @@
     <w:p>
       <w:r>
         <w:pict w14:anchorId="2F3E18AE">
-          <v:rect id="_x0000_i1257" style="width:0;height:1.5pt" o:hralign="center" o:hrstd="t" o:hr="t" fillcolor="#a0a0a0" stroked="f"/>
+          <v:rect id="_x0000_i1048" style="width:0;height:1.5pt" o:hralign="center" o:hrstd="t" o:hr="t" fillcolor="#a0a0a0" stroked="f"/>
         </w:pict>
       </w:r>
     </w:p>
@@ -1570,17 +1585,8 @@
           <w:b/>
           <w:bCs/>
         </w:rPr>
-        <w:t xml:space="preserve"> Configuración de </w:t>
-      </w:r>
-      <w:proofErr w:type="spellStart"/>
-      <w:r>
-        <w:rPr>
-          <w:b/>
-          <w:bCs/>
-        </w:rPr>
-        <w:t>features</w:t>
-      </w:r>
-      <w:proofErr w:type="spellEnd"/>
+        <w:t xml:space="preserve"> Configuración de features</w:t>
+      </w:r>
     </w:p>
     <w:p>
       <w:r>
@@ -1588,20 +1594,8 @@
       </w:r>
       <w:r>
         <w:br/>
-      </w:r>
-      <w:proofErr w:type="spellStart"/>
-      <w:r>
-        <w:t>When</w:t>
-      </w:r>
-      <w:proofErr w:type="spellEnd"/>
-      <w:r>
-        <w:t xml:space="preserve"> el administrador habilita </w:t>
-      </w:r>
-      <w:proofErr w:type="spellStart"/>
-      <w:r>
-        <w:t>features</w:t>
-      </w:r>
-      <w:proofErr w:type="spellEnd"/>
+        <w:t>When el administrador habilita features</w:t>
+      </w:r>
       <w:r>
         <w:br/>
         <w:t>Then el sistema debe asociarlas correctamente</w:t>
@@ -1610,7 +1604,7 @@
     <w:p>
       <w:r>
         <w:pict w14:anchorId="7C459503">
-          <v:rect id="_x0000_i1258" style="width:0;height:1.5pt" o:hralign="center" o:hrstd="t" o:hr="t" fillcolor="#a0a0a0" stroked="f"/>
+          <v:rect id="_x0000_i1049" style="width:0;height:1.5pt" o:hralign="center" o:hrstd="t" o:hr="t" fillcolor="#a0a0a0" stroked="f"/>
         </w:pict>
       </w:r>
     </w:p>
@@ -1643,22 +1637,7 @@
       </w:r>
       <w:r>
         <w:br/>
-      </w:r>
-      <w:proofErr w:type="spellStart"/>
-      <w:r>
-        <w:t>When</w:t>
-      </w:r>
-      <w:proofErr w:type="spellEnd"/>
-      <w:r>
-        <w:t xml:space="preserve"> intenta usar una </w:t>
-      </w:r>
-      <w:proofErr w:type="spellStart"/>
-      <w:r>
-        <w:t>feature</w:t>
-      </w:r>
-      <w:proofErr w:type="spellEnd"/>
-      <w:r>
-        <w:t xml:space="preserve"> avanzada</w:t>
+        <w:t>When intenta usar una feature avanzada</w:t>
       </w:r>
       <w:r>
         <w:br/>
@@ -1668,7 +1647,7 @@
     <w:p>
       <w:r>
         <w:pict w14:anchorId="14729113">
-          <v:rect id="_x0000_i1259" style="width:0;height:1.5pt" o:hralign="center" o:hrstd="t" o:hr="t" fillcolor="#a0a0a0" stroked="f"/>
+          <v:rect id="_x0000_i1050" style="width:0;height:1.5pt" o:hralign="center" o:hrstd="t" o:hr="t" fillcolor="#a0a0a0" stroked="f"/>
         </w:pict>
       </w:r>
     </w:p>
@@ -1701,14 +1680,7 @@
       </w:r>
       <w:r>
         <w:br/>
-      </w:r>
-      <w:proofErr w:type="spellStart"/>
-      <w:r>
-        <w:t>When</w:t>
-      </w:r>
-      <w:proofErr w:type="spellEnd"/>
-      <w:r>
-        <w:t xml:space="preserve"> el usuario intenta acceder</w:t>
+        <w:t>When el usuario intenta acceder</w:t>
       </w:r>
       <w:r>
         <w:br/>
@@ -1718,7 +1690,7 @@
     <w:p>
       <w:r>
         <w:pict w14:anchorId="0A34387C">
-          <v:rect id="_x0000_i1260" style="width:0;height:1.5pt" o:hralign="center" o:hrstd="t" o:hr="t" fillcolor="#a0a0a0" stroked="f"/>
+          <v:rect id="_x0000_i1051" style="width:0;height:1.5pt" o:hralign="center" o:hrstd="t" o:hr="t" fillcolor="#a0a0a0" stroked="f"/>
         </w:pict>
       </w:r>
     </w:p>
@@ -1757,6 +1729,7 @@
         </w:numPr>
       </w:pPr>
       <w:r>
+        <w:lastRenderedPageBreak/>
         <w:t>plan</w:t>
       </w:r>
     </w:p>
@@ -1767,14 +1740,12 @@
           <w:numId w:val="67"/>
         </w:numPr>
       </w:pPr>
-      <w:proofErr w:type="spellStart"/>
       <w:r>
         <w:t>plan_featur</w:t>
       </w:r>
       <w:r>
         <w:t>e</w:t>
       </w:r>
-      <w:proofErr w:type="spellEnd"/>
     </w:p>
     <w:p>
       <w:pPr>
@@ -1783,11 +1754,9 @@
           <w:numId w:val="67"/>
         </w:numPr>
       </w:pPr>
-      <w:proofErr w:type="spellStart"/>
       <w:r>
         <w:t>plan_module</w:t>
       </w:r>
-      <w:proofErr w:type="spellEnd"/>
     </w:p>
     <w:p>
       <w:pPr>
@@ -1796,11 +1765,9 @@
           <w:numId w:val="67"/>
         </w:numPr>
       </w:pPr>
-      <w:proofErr w:type="spellStart"/>
       <w:r>
         <w:t>plan_form</w:t>
       </w:r>
-      <w:proofErr w:type="spellEnd"/>
     </w:p>
     <w:p>
       <w:pPr>
@@ -1820,19 +1787,9 @@
           <w:numId w:val="67"/>
         </w:numPr>
       </w:pPr>
-      <w:proofErr w:type="spellStart"/>
-      <w:r>
-        <w:t>backend</w:t>
-      </w:r>
-      <w:proofErr w:type="spellEnd"/>
-      <w:r>
-        <w:t xml:space="preserve"> + </w:t>
-      </w:r>
-      <w:proofErr w:type="spellStart"/>
-      <w:r>
-        <w:t>frontend</w:t>
-      </w:r>
-      <w:proofErr w:type="spellEnd"/>
+      <w:r>
+        <w:t>backend + frontend</w:t>
+      </w:r>
     </w:p>
     <w:p>
       <w:pPr>
@@ -1842,15 +1799,7 @@
         </w:numPr>
       </w:pPr>
       <w:r>
-        <w:t xml:space="preserve">Uso en </w:t>
-      </w:r>
-      <w:proofErr w:type="spellStart"/>
-      <w:r>
-        <w:t>runtime</w:t>
-      </w:r>
-      <w:proofErr w:type="spellEnd"/>
-      <w:r>
-        <w:t>:</w:t>
+        <w:t>Uso en runtime:</w:t>
       </w:r>
     </w:p>
     <w:p>
@@ -1871,13 +1820,8 @@
           <w:numId w:val="67"/>
         </w:numPr>
       </w:pPr>
-      <w:proofErr w:type="spellStart"/>
-      <w:r>
-        <w:t>Endpoints</w:t>
-      </w:r>
-      <w:proofErr w:type="spellEnd"/>
-      <w:r>
-        <w:t xml:space="preserve"> sugeridos:</w:t>
+      <w:r>
+        <w:t>Endpoints sugeridos:</w:t>
       </w:r>
     </w:p>
     <w:p>
@@ -1889,13 +1833,8 @@
         </w:numPr>
       </w:pPr>
       <w:r>
-        <w:t>POST /</w:t>
-      </w:r>
-      <w:proofErr w:type="spellStart"/>
-      <w:r>
-        <w:t>plans</w:t>
-      </w:r>
-      <w:proofErr w:type="spellEnd"/>
+        <w:t>POST /plans</w:t>
+      </w:r>
     </w:p>
     <w:p>
       <w:pPr>
@@ -1906,15 +1845,7 @@
         </w:numPr>
       </w:pPr>
       <w:r>
-        <w:t>PUT /</w:t>
-      </w:r>
-      <w:proofErr w:type="spellStart"/>
-      <w:r>
-        <w:t>plans</w:t>
-      </w:r>
-      <w:proofErr w:type="spellEnd"/>
-      <w:r>
-        <w:t>/{id}</w:t>
+        <w:t>PUT /plans/{id}</w:t>
       </w:r>
     </w:p>
     <w:p>
@@ -1926,13 +1857,8 @@
         </w:numPr>
       </w:pPr>
       <w:r>
-        <w:t>GET /</w:t>
-      </w:r>
-      <w:proofErr w:type="spellStart"/>
-      <w:r>
-        <w:t>plans</w:t>
-      </w:r>
-      <w:proofErr w:type="spellEnd"/>
+        <w:t>GET /plans</w:t>
+      </w:r>
     </w:p>
     <w:p>
       <w:pPr>
@@ -1943,22 +1869,8 @@
         </w:numPr>
       </w:pPr>
       <w:r>
-        <w:lastRenderedPageBreak/>
-        <w:t>GET /</w:t>
-      </w:r>
-      <w:proofErr w:type="spellStart"/>
-      <w:r>
-        <w:t>plans</w:t>
-      </w:r>
-      <w:proofErr w:type="spellEnd"/>
-      <w:r>
-        <w:t>/{id}/</w:t>
-      </w:r>
-      <w:proofErr w:type="spellStart"/>
-      <w:r>
-        <w:t>features</w:t>
-      </w:r>
-      <w:proofErr w:type="spellEnd"/>
+        <w:t>GET /plans/{id}/features</w:t>
+      </w:r>
     </w:p>
     <w:p>
       <w:pPr>
@@ -1969,15 +1881,7 @@
         </w:numPr>
       </w:pPr>
       <w:r>
-        <w:t>GET /</w:t>
-      </w:r>
-      <w:proofErr w:type="spellStart"/>
-      <w:r>
-        <w:t>plans</w:t>
-      </w:r>
-      <w:proofErr w:type="spellEnd"/>
-      <w:r>
-        <w:t>/{id}/modules</w:t>
+        <w:t>GET /plans/{id}/modules</w:t>
       </w:r>
       <w:r>
         <w:br/>
@@ -1986,7 +1890,7 @@
     <w:p>
       <w:r>
         <w:pict w14:anchorId="10679177">
-          <v:rect id="_x0000_i1261" style="width:0;height:1.5pt" o:hralign="center" o:hrstd="t" o:hr="t" fillcolor="#a0a0a0" stroked="f"/>
+          <v:rect id="_x0000_i1052" style="width:0;height:1.5pt" o:hralign="center" o:hrstd="t" o:hr="t" fillcolor="#a0a0a0" stroked="f"/>
         </w:pict>
       </w:r>
     </w:p>
@@ -7822,6 +7726,119 @@
     </w:lvl>
   </w:abstractNum>
   <w:abstractNum w:abstractNumId="40" w15:restartNumberingAfterBreak="0">
+    <w:nsid w:val="54964CD9"/>
+    <w:multiLevelType w:val="hybridMultilevel"/>
+    <w:tmpl w:val="E54C18AC"/>
+    <w:lvl w:ilvl="0" w:tplc="240A0001">
+      <w:start w:val="1"/>
+      <w:numFmt w:val="bullet"/>
+      <w:lvlText w:val=""/>
+      <w:lvlJc w:val="left"/>
+      <w:pPr>
+        <w:ind w:left="1440" w:hanging="360"/>
+      </w:pPr>
+      <w:rPr>
+        <w:rFonts w:ascii="Symbol" w:hAnsi="Symbol" w:hint="default"/>
+      </w:rPr>
+    </w:lvl>
+    <w:lvl w:ilvl="1" w:tplc="240A0003" w:tentative="1">
+      <w:start w:val="1"/>
+      <w:numFmt w:val="bullet"/>
+      <w:lvlText w:val="o"/>
+      <w:lvlJc w:val="left"/>
+      <w:pPr>
+        <w:ind w:left="2160" w:hanging="360"/>
+      </w:pPr>
+      <w:rPr>
+        <w:rFonts w:ascii="Courier New" w:hAnsi="Courier New" w:cs="Courier New" w:hint="default"/>
+      </w:rPr>
+    </w:lvl>
+    <w:lvl w:ilvl="2" w:tplc="240A0005" w:tentative="1">
+      <w:start w:val="1"/>
+      <w:numFmt w:val="bullet"/>
+      <w:lvlText w:val=""/>
+      <w:lvlJc w:val="left"/>
+      <w:pPr>
+        <w:ind w:left="2880" w:hanging="360"/>
+      </w:pPr>
+      <w:rPr>
+        <w:rFonts w:ascii="Wingdings" w:hAnsi="Wingdings" w:hint="default"/>
+      </w:rPr>
+    </w:lvl>
+    <w:lvl w:ilvl="3" w:tplc="240A0001" w:tentative="1">
+      <w:start w:val="1"/>
+      <w:numFmt w:val="bullet"/>
+      <w:lvlText w:val=""/>
+      <w:lvlJc w:val="left"/>
+      <w:pPr>
+        <w:ind w:left="3600" w:hanging="360"/>
+      </w:pPr>
+      <w:rPr>
+        <w:rFonts w:ascii="Symbol" w:hAnsi="Symbol" w:hint="default"/>
+      </w:rPr>
+    </w:lvl>
+    <w:lvl w:ilvl="4" w:tplc="240A0003" w:tentative="1">
+      <w:start w:val="1"/>
+      <w:numFmt w:val="bullet"/>
+      <w:lvlText w:val="o"/>
+      <w:lvlJc w:val="left"/>
+      <w:pPr>
+        <w:ind w:left="4320" w:hanging="360"/>
+      </w:pPr>
+      <w:rPr>
+        <w:rFonts w:ascii="Courier New" w:hAnsi="Courier New" w:cs="Courier New" w:hint="default"/>
+      </w:rPr>
+    </w:lvl>
+    <w:lvl w:ilvl="5" w:tplc="240A0005" w:tentative="1">
+      <w:start w:val="1"/>
+      <w:numFmt w:val="bullet"/>
+      <w:lvlText w:val=""/>
+      <w:lvlJc w:val="left"/>
+      <w:pPr>
+        <w:ind w:left="5040" w:hanging="360"/>
+      </w:pPr>
+      <w:rPr>
+        <w:rFonts w:ascii="Wingdings" w:hAnsi="Wingdings" w:hint="default"/>
+      </w:rPr>
+    </w:lvl>
+    <w:lvl w:ilvl="6" w:tplc="240A0001" w:tentative="1">
+      <w:start w:val="1"/>
+      <w:numFmt w:val="bullet"/>
+      <w:lvlText w:val=""/>
+      <w:lvlJc w:val="left"/>
+      <w:pPr>
+        <w:ind w:left="5760" w:hanging="360"/>
+      </w:pPr>
+      <w:rPr>
+        <w:rFonts w:ascii="Symbol" w:hAnsi="Symbol" w:hint="default"/>
+      </w:rPr>
+    </w:lvl>
+    <w:lvl w:ilvl="7" w:tplc="240A0003" w:tentative="1">
+      <w:start w:val="1"/>
+      <w:numFmt w:val="bullet"/>
+      <w:lvlText w:val="o"/>
+      <w:lvlJc w:val="left"/>
+      <w:pPr>
+        <w:ind w:left="6480" w:hanging="360"/>
+      </w:pPr>
+      <w:rPr>
+        <w:rFonts w:ascii="Courier New" w:hAnsi="Courier New" w:cs="Courier New" w:hint="default"/>
+      </w:rPr>
+    </w:lvl>
+    <w:lvl w:ilvl="8" w:tplc="240A0005" w:tentative="1">
+      <w:start w:val="1"/>
+      <w:numFmt w:val="bullet"/>
+      <w:lvlText w:val=""/>
+      <w:lvlJc w:val="left"/>
+      <w:pPr>
+        <w:ind w:left="7200" w:hanging="360"/>
+      </w:pPr>
+      <w:rPr>
+        <w:rFonts w:ascii="Wingdings" w:hAnsi="Wingdings" w:hint="default"/>
+      </w:rPr>
+    </w:lvl>
+  </w:abstractNum>
+  <w:abstractNum w:abstractNumId="41" w15:restartNumberingAfterBreak="0">
     <w:nsid w:val="56FF4EF4"/>
     <w:multiLevelType w:val="multilevel"/>
     <w:tmpl w:val="4358FCA6"/>
@@ -7970,7 +7987,7 @@
       </w:rPr>
     </w:lvl>
   </w:abstractNum>
-  <w:abstractNum w:abstractNumId="41" w15:restartNumberingAfterBreak="0">
+  <w:abstractNum w:abstractNumId="42" w15:restartNumberingAfterBreak="0">
     <w:nsid w:val="5AED7BF4"/>
     <w:multiLevelType w:val="multilevel"/>
     <w:tmpl w:val="2AF6A30A"/>
@@ -8119,7 +8136,7 @@
       </w:rPr>
     </w:lvl>
   </w:abstractNum>
-  <w:abstractNum w:abstractNumId="42" w15:restartNumberingAfterBreak="0">
+  <w:abstractNum w:abstractNumId="43" w15:restartNumberingAfterBreak="0">
     <w:nsid w:val="5B077728"/>
     <w:multiLevelType w:val="hybridMultilevel"/>
     <w:tmpl w:val="1F9AAF68"/>
@@ -8232,7 +8249,7 @@
       </w:rPr>
     </w:lvl>
   </w:abstractNum>
-  <w:abstractNum w:abstractNumId="43" w15:restartNumberingAfterBreak="0">
+  <w:abstractNum w:abstractNumId="44" w15:restartNumberingAfterBreak="0">
     <w:nsid w:val="5B4951F2"/>
     <w:multiLevelType w:val="hybridMultilevel"/>
     <w:tmpl w:val="C5DE5A24"/>
@@ -8321,7 +8338,7 @@
       </w:pPr>
     </w:lvl>
   </w:abstractNum>
-  <w:abstractNum w:abstractNumId="44" w15:restartNumberingAfterBreak="0">
+  <w:abstractNum w:abstractNumId="45" w15:restartNumberingAfterBreak="0">
     <w:nsid w:val="5E9C4966"/>
     <w:multiLevelType w:val="multilevel"/>
     <w:tmpl w:val="14F8D81A"/>
@@ -8470,7 +8487,7 @@
       </w:rPr>
     </w:lvl>
   </w:abstractNum>
-  <w:abstractNum w:abstractNumId="45" w15:restartNumberingAfterBreak="0">
+  <w:abstractNum w:abstractNumId="46" w15:restartNumberingAfterBreak="0">
     <w:nsid w:val="5F59290A"/>
     <w:multiLevelType w:val="hybridMultilevel"/>
     <w:tmpl w:val="5F24514E"/>
@@ -8583,7 +8600,7 @@
       </w:rPr>
     </w:lvl>
   </w:abstractNum>
-  <w:abstractNum w:abstractNumId="46" w15:restartNumberingAfterBreak="0">
+  <w:abstractNum w:abstractNumId="47" w15:restartNumberingAfterBreak="0">
     <w:nsid w:val="5F9B1B53"/>
     <w:multiLevelType w:val="multilevel"/>
     <w:tmpl w:val="F89E6BF0"/>
@@ -8700,7 +8717,7 @@
       </w:pPr>
     </w:lvl>
   </w:abstractNum>
-  <w:abstractNum w:abstractNumId="47" w15:restartNumberingAfterBreak="0">
+  <w:abstractNum w:abstractNumId="48" w15:restartNumberingAfterBreak="0">
     <w:nsid w:val="60805789"/>
     <w:multiLevelType w:val="multilevel"/>
     <w:tmpl w:val="CAC2F0DC"/>
@@ -8849,7 +8866,7 @@
       </w:rPr>
     </w:lvl>
   </w:abstractNum>
-  <w:abstractNum w:abstractNumId="48" w15:restartNumberingAfterBreak="0">
+  <w:abstractNum w:abstractNumId="49" w15:restartNumberingAfterBreak="0">
     <w:nsid w:val="615E100D"/>
     <w:multiLevelType w:val="hybridMultilevel"/>
     <w:tmpl w:val="95B6F304"/>
@@ -8962,7 +8979,7 @@
       </w:rPr>
     </w:lvl>
   </w:abstractNum>
-  <w:abstractNum w:abstractNumId="49" w15:restartNumberingAfterBreak="0">
+  <w:abstractNum w:abstractNumId="50" w15:restartNumberingAfterBreak="0">
     <w:nsid w:val="63CD0741"/>
     <w:multiLevelType w:val="multilevel"/>
     <w:tmpl w:val="0AA222C2"/>
@@ -9111,7 +9128,7 @@
       </w:rPr>
     </w:lvl>
   </w:abstractNum>
-  <w:abstractNum w:abstractNumId="50" w15:restartNumberingAfterBreak="0">
+  <w:abstractNum w:abstractNumId="51" w15:restartNumberingAfterBreak="0">
     <w:nsid w:val="66255596"/>
     <w:multiLevelType w:val="multilevel"/>
     <w:tmpl w:val="260CDFBC"/>
@@ -9260,7 +9277,7 @@
       </w:rPr>
     </w:lvl>
   </w:abstractNum>
-  <w:abstractNum w:abstractNumId="51" w15:restartNumberingAfterBreak="0">
+  <w:abstractNum w:abstractNumId="52" w15:restartNumberingAfterBreak="0">
     <w:nsid w:val="69A47DD5"/>
     <w:multiLevelType w:val="multilevel"/>
     <w:tmpl w:val="6738703A"/>
@@ -9409,7 +9426,7 @@
       </w:rPr>
     </w:lvl>
   </w:abstractNum>
-  <w:abstractNum w:abstractNumId="52" w15:restartNumberingAfterBreak="0">
+  <w:abstractNum w:abstractNumId="53" w15:restartNumberingAfterBreak="0">
     <w:nsid w:val="69F82869"/>
     <w:multiLevelType w:val="multilevel"/>
     <w:tmpl w:val="DB5AB2A4"/>
@@ -9558,7 +9575,7 @@
       </w:rPr>
     </w:lvl>
   </w:abstractNum>
-  <w:abstractNum w:abstractNumId="53" w15:restartNumberingAfterBreak="0">
+  <w:abstractNum w:abstractNumId="54" w15:restartNumberingAfterBreak="0">
     <w:nsid w:val="6C67685B"/>
     <w:multiLevelType w:val="multilevel"/>
     <w:tmpl w:val="5936D26A"/>
@@ -9671,7 +9688,7 @@
       </w:pPr>
     </w:lvl>
   </w:abstractNum>
-  <w:abstractNum w:abstractNumId="54" w15:restartNumberingAfterBreak="0">
+  <w:abstractNum w:abstractNumId="55" w15:restartNumberingAfterBreak="0">
     <w:nsid w:val="6DF06A6A"/>
     <w:multiLevelType w:val="multilevel"/>
     <w:tmpl w:val="460E1CB4"/>
@@ -9820,7 +9837,7 @@
       </w:rPr>
     </w:lvl>
   </w:abstractNum>
-  <w:abstractNum w:abstractNumId="55" w15:restartNumberingAfterBreak="0">
+  <w:abstractNum w:abstractNumId="56" w15:restartNumberingAfterBreak="0">
     <w:nsid w:val="70537CA9"/>
     <w:multiLevelType w:val="hybridMultilevel"/>
     <w:tmpl w:val="3058F76C"/>
@@ -9933,7 +9950,7 @@
       </w:rPr>
     </w:lvl>
   </w:abstractNum>
-  <w:abstractNum w:abstractNumId="56" w15:restartNumberingAfterBreak="0">
+  <w:abstractNum w:abstractNumId="57" w15:restartNumberingAfterBreak="0">
     <w:nsid w:val="710D3F1D"/>
     <w:multiLevelType w:val="multilevel"/>
     <w:tmpl w:val="E6106EDE"/>
@@ -10082,7 +10099,7 @@
       </w:rPr>
     </w:lvl>
   </w:abstractNum>
-  <w:abstractNum w:abstractNumId="57" w15:restartNumberingAfterBreak="0">
+  <w:abstractNum w:abstractNumId="58" w15:restartNumberingAfterBreak="0">
     <w:nsid w:val="712A333A"/>
     <w:multiLevelType w:val="multilevel"/>
     <w:tmpl w:val="C76292F8"/>
@@ -10231,7 +10248,97 @@
       </w:rPr>
     </w:lvl>
   </w:abstractNum>
-  <w:abstractNum w:abstractNumId="58" w15:restartNumberingAfterBreak="0">
+  <w:abstractNum w:abstractNumId="59" w15:restartNumberingAfterBreak="0">
+    <w:nsid w:val="71E83227"/>
+    <w:multiLevelType w:val="hybridMultilevel"/>
+    <w:tmpl w:val="71CE782A"/>
+    <w:lvl w:ilvl="0" w:tplc="41AE0E3E">
+      <w:start w:val="1"/>
+      <w:numFmt w:val="decimal"/>
+      <w:lvlText w:val="%1."/>
+      <w:lvlJc w:val="left"/>
+      <w:pPr>
+        <w:ind w:left="720" w:hanging="360"/>
+      </w:pPr>
+      <w:rPr>
+        <w:b w:val="0"/>
+        <w:bCs w:val="0"/>
+      </w:rPr>
+    </w:lvl>
+    <w:lvl w:ilvl="1" w:tplc="240A0019" w:tentative="1">
+      <w:start w:val="1"/>
+      <w:numFmt w:val="lowerLetter"/>
+      <w:lvlText w:val="%2."/>
+      <w:lvlJc w:val="left"/>
+      <w:pPr>
+        <w:ind w:left="1440" w:hanging="360"/>
+      </w:pPr>
+    </w:lvl>
+    <w:lvl w:ilvl="2" w:tplc="240A001B" w:tentative="1">
+      <w:start w:val="1"/>
+      <w:numFmt w:val="lowerRoman"/>
+      <w:lvlText w:val="%3."/>
+      <w:lvlJc w:val="right"/>
+      <w:pPr>
+        <w:ind w:left="2160" w:hanging="180"/>
+      </w:pPr>
+    </w:lvl>
+    <w:lvl w:ilvl="3" w:tplc="240A000F" w:tentative="1">
+      <w:start w:val="1"/>
+      <w:numFmt w:val="decimal"/>
+      <w:lvlText w:val="%4."/>
+      <w:lvlJc w:val="left"/>
+      <w:pPr>
+        <w:ind w:left="2880" w:hanging="360"/>
+      </w:pPr>
+    </w:lvl>
+    <w:lvl w:ilvl="4" w:tplc="240A0019" w:tentative="1">
+      <w:start w:val="1"/>
+      <w:numFmt w:val="lowerLetter"/>
+      <w:lvlText w:val="%5."/>
+      <w:lvlJc w:val="left"/>
+      <w:pPr>
+        <w:ind w:left="3600" w:hanging="360"/>
+      </w:pPr>
+    </w:lvl>
+    <w:lvl w:ilvl="5" w:tplc="240A001B" w:tentative="1">
+      <w:start w:val="1"/>
+      <w:numFmt w:val="lowerRoman"/>
+      <w:lvlText w:val="%6."/>
+      <w:lvlJc w:val="right"/>
+      <w:pPr>
+        <w:ind w:left="4320" w:hanging="180"/>
+      </w:pPr>
+    </w:lvl>
+    <w:lvl w:ilvl="6" w:tplc="240A000F" w:tentative="1">
+      <w:start w:val="1"/>
+      <w:numFmt w:val="decimal"/>
+      <w:lvlText w:val="%7."/>
+      <w:lvlJc w:val="left"/>
+      <w:pPr>
+        <w:ind w:left="5040" w:hanging="360"/>
+      </w:pPr>
+    </w:lvl>
+    <w:lvl w:ilvl="7" w:tplc="240A0019" w:tentative="1">
+      <w:start w:val="1"/>
+      <w:numFmt w:val="lowerLetter"/>
+      <w:lvlText w:val="%8."/>
+      <w:lvlJc w:val="left"/>
+      <w:pPr>
+        <w:ind w:left="5760" w:hanging="360"/>
+      </w:pPr>
+    </w:lvl>
+    <w:lvl w:ilvl="8" w:tplc="240A001B" w:tentative="1">
+      <w:start w:val="1"/>
+      <w:numFmt w:val="lowerRoman"/>
+      <w:lvlText w:val="%9."/>
+      <w:lvlJc w:val="right"/>
+      <w:pPr>
+        <w:ind w:left="6480" w:hanging="180"/>
+      </w:pPr>
+    </w:lvl>
+  </w:abstractNum>
+  <w:abstractNum w:abstractNumId="60" w15:restartNumberingAfterBreak="0">
     <w:nsid w:val="74355AA1"/>
     <w:multiLevelType w:val="multilevel"/>
     <w:tmpl w:val="23FE0BD4"/>
@@ -10380,7 +10487,7 @@
       </w:rPr>
     </w:lvl>
   </w:abstractNum>
-  <w:abstractNum w:abstractNumId="59" w15:restartNumberingAfterBreak="0">
+  <w:abstractNum w:abstractNumId="61" w15:restartNumberingAfterBreak="0">
     <w:nsid w:val="7472052C"/>
     <w:multiLevelType w:val="multilevel"/>
     <w:tmpl w:val="52DE7DE4"/>
@@ -10497,7 +10604,7 @@
       </w:pPr>
     </w:lvl>
   </w:abstractNum>
-  <w:abstractNum w:abstractNumId="60" w15:restartNumberingAfterBreak="0">
+  <w:abstractNum w:abstractNumId="62" w15:restartNumberingAfterBreak="0">
     <w:nsid w:val="753412D4"/>
     <w:multiLevelType w:val="multilevel"/>
     <w:tmpl w:val="F468FC3E"/>
@@ -10646,7 +10753,7 @@
       </w:rPr>
     </w:lvl>
   </w:abstractNum>
-  <w:abstractNum w:abstractNumId="61" w15:restartNumberingAfterBreak="0">
+  <w:abstractNum w:abstractNumId="63" w15:restartNumberingAfterBreak="0">
     <w:nsid w:val="766F43FE"/>
     <w:multiLevelType w:val="multilevel"/>
     <w:tmpl w:val="75C81C9A"/>
@@ -10795,7 +10902,7 @@
       </w:rPr>
     </w:lvl>
   </w:abstractNum>
-  <w:abstractNum w:abstractNumId="62" w15:restartNumberingAfterBreak="0">
+  <w:abstractNum w:abstractNumId="64" w15:restartNumberingAfterBreak="0">
     <w:nsid w:val="77623382"/>
     <w:multiLevelType w:val="multilevel"/>
     <w:tmpl w:val="6D5A7CA4"/>
@@ -10944,7 +11051,7 @@
       </w:rPr>
     </w:lvl>
   </w:abstractNum>
-  <w:abstractNum w:abstractNumId="63" w15:restartNumberingAfterBreak="0">
+  <w:abstractNum w:abstractNumId="65" w15:restartNumberingAfterBreak="0">
     <w:nsid w:val="79550668"/>
     <w:multiLevelType w:val="hybridMultilevel"/>
     <w:tmpl w:val="0ADA8990"/>
@@ -11057,7 +11164,7 @@
       </w:rPr>
     </w:lvl>
   </w:abstractNum>
-  <w:abstractNum w:abstractNumId="64" w15:restartNumberingAfterBreak="0">
+  <w:abstractNum w:abstractNumId="66" w15:restartNumberingAfterBreak="0">
     <w:nsid w:val="7A7C2B23"/>
     <w:multiLevelType w:val="multilevel"/>
     <w:tmpl w:val="0FDA8DCC"/>
@@ -11206,7 +11313,7 @@
       </w:rPr>
     </w:lvl>
   </w:abstractNum>
-  <w:abstractNum w:abstractNumId="65" w15:restartNumberingAfterBreak="0">
+  <w:abstractNum w:abstractNumId="67" w15:restartNumberingAfterBreak="0">
     <w:nsid w:val="7F070462"/>
     <w:multiLevelType w:val="multilevel"/>
     <w:tmpl w:val="B2C4BBFC"/>
@@ -11355,7 +11462,7 @@
       </w:rPr>
     </w:lvl>
   </w:abstractNum>
-  <w:abstractNum w:abstractNumId="66" w15:restartNumberingAfterBreak="0">
+  <w:abstractNum w:abstractNumId="68" w15:restartNumberingAfterBreak="0">
     <w:nsid w:val="7F3312DD"/>
     <w:multiLevelType w:val="multilevel"/>
     <w:tmpl w:val="BF6E663E"/>
@@ -11504,7 +11611,7 @@
       </w:rPr>
     </w:lvl>
   </w:abstractNum>
-  <w:abstractNum w:abstractNumId="67" w15:restartNumberingAfterBreak="0">
+  <w:abstractNum w:abstractNumId="69" w15:restartNumberingAfterBreak="0">
     <w:nsid w:val="7FC87123"/>
     <w:multiLevelType w:val="multilevel"/>
     <w:tmpl w:val="34368748"/>
@@ -11654,7 +11761,7 @@
     </w:lvl>
   </w:abstractNum>
   <w:num w:numId="1" w16cid:durableId="1360667528">
-    <w:abstractNumId w:val="57"/>
+    <w:abstractNumId w:val="58"/>
   </w:num>
   <w:num w:numId="2" w16cid:durableId="1455564292">
     <w:abstractNumId w:val="32"/>
@@ -11672,16 +11779,16 @@
     <w:abstractNumId w:val="33"/>
   </w:num>
   <w:num w:numId="7" w16cid:durableId="1489709130">
-    <w:abstractNumId w:val="61"/>
+    <w:abstractNumId w:val="63"/>
   </w:num>
   <w:num w:numId="8" w16cid:durableId="1309438029">
     <w:abstractNumId w:val="38"/>
   </w:num>
   <w:num w:numId="9" w16cid:durableId="986739029">
-    <w:abstractNumId w:val="60"/>
+    <w:abstractNumId w:val="62"/>
   </w:num>
   <w:num w:numId="10" w16cid:durableId="533271430">
-    <w:abstractNumId w:val="67"/>
+    <w:abstractNumId w:val="69"/>
   </w:num>
   <w:num w:numId="11" w16cid:durableId="598409456">
     <w:abstractNumId w:val="19"/>
@@ -11693,10 +11800,10 @@
     <w:abstractNumId w:val="18"/>
   </w:num>
   <w:num w:numId="14" w16cid:durableId="1634409037">
-    <w:abstractNumId w:val="66"/>
+    <w:abstractNumId w:val="68"/>
   </w:num>
   <w:num w:numId="15" w16cid:durableId="1889680396">
-    <w:abstractNumId w:val="45"/>
+    <w:abstractNumId w:val="46"/>
   </w:num>
   <w:num w:numId="16" w16cid:durableId="71315399">
     <w:abstractNumId w:val="28"/>
@@ -11711,19 +11818,19 @@
     <w:abstractNumId w:val="3"/>
   </w:num>
   <w:num w:numId="20" w16cid:durableId="988635524">
-    <w:abstractNumId w:val="42"/>
+    <w:abstractNumId w:val="43"/>
   </w:num>
   <w:num w:numId="21" w16cid:durableId="1823424661">
-    <w:abstractNumId w:val="56"/>
+    <w:abstractNumId w:val="57"/>
   </w:num>
   <w:num w:numId="22" w16cid:durableId="1815876062">
-    <w:abstractNumId w:val="49"/>
+    <w:abstractNumId w:val="50"/>
   </w:num>
   <w:num w:numId="23" w16cid:durableId="1842700722">
-    <w:abstractNumId w:val="44"/>
+    <w:abstractNumId w:val="45"/>
   </w:num>
   <w:num w:numId="24" w16cid:durableId="1791972421">
-    <w:abstractNumId w:val="51"/>
+    <w:abstractNumId w:val="52"/>
   </w:num>
   <w:num w:numId="25" w16cid:durableId="299269595">
     <w:abstractNumId w:val="6"/>
@@ -11732,25 +11839,25 @@
     <w:abstractNumId w:val="2"/>
   </w:num>
   <w:num w:numId="27" w16cid:durableId="533231044">
-    <w:abstractNumId w:val="46"/>
+    <w:abstractNumId w:val="47"/>
   </w:num>
   <w:num w:numId="28" w16cid:durableId="815804407">
-    <w:abstractNumId w:val="65"/>
+    <w:abstractNumId w:val="67"/>
   </w:num>
   <w:num w:numId="29" w16cid:durableId="1433667481">
-    <w:abstractNumId w:val="47"/>
+    <w:abstractNumId w:val="48"/>
   </w:num>
   <w:num w:numId="30" w16cid:durableId="348069865">
     <w:abstractNumId w:val="21"/>
   </w:num>
   <w:num w:numId="31" w16cid:durableId="480926140">
-    <w:abstractNumId w:val="64"/>
+    <w:abstractNumId w:val="66"/>
   </w:num>
   <w:num w:numId="32" w16cid:durableId="1491411012">
-    <w:abstractNumId w:val="52"/>
+    <w:abstractNumId w:val="53"/>
   </w:num>
   <w:num w:numId="33" w16cid:durableId="329991218">
-    <w:abstractNumId w:val="41"/>
+    <w:abstractNumId w:val="42"/>
   </w:num>
   <w:num w:numId="34" w16cid:durableId="1194996409">
     <w:abstractNumId w:val="24"/>
@@ -11768,10 +11875,10 @@
     <w:abstractNumId w:val="26"/>
   </w:num>
   <w:num w:numId="39" w16cid:durableId="1598563105">
-    <w:abstractNumId w:val="50"/>
+    <w:abstractNumId w:val="51"/>
   </w:num>
   <w:num w:numId="40" w16cid:durableId="1538932344">
-    <w:abstractNumId w:val="53"/>
+    <w:abstractNumId w:val="54"/>
   </w:num>
   <w:num w:numId="41" w16cid:durableId="1479416726">
     <w:abstractNumId w:val="34"/>
@@ -11780,7 +11887,7 @@
     <w:abstractNumId w:val="12"/>
   </w:num>
   <w:num w:numId="43" w16cid:durableId="153764142">
-    <w:abstractNumId w:val="40"/>
+    <w:abstractNumId w:val="41"/>
   </w:num>
   <w:num w:numId="44" w16cid:durableId="1289094590">
     <w:abstractNumId w:val="31"/>
@@ -11798,37 +11905,37 @@
     <w:abstractNumId w:val="9"/>
   </w:num>
   <w:num w:numId="49" w16cid:durableId="260649866">
-    <w:abstractNumId w:val="43"/>
+    <w:abstractNumId w:val="44"/>
   </w:num>
   <w:num w:numId="50" w16cid:durableId="1887450786">
     <w:abstractNumId w:val="17"/>
   </w:num>
   <w:num w:numId="51" w16cid:durableId="952978158">
-    <w:abstractNumId w:val="48"/>
+    <w:abstractNumId w:val="49"/>
   </w:num>
   <w:num w:numId="52" w16cid:durableId="342318345">
-    <w:abstractNumId w:val="55"/>
+    <w:abstractNumId w:val="56"/>
   </w:num>
   <w:num w:numId="53" w16cid:durableId="478497903">
     <w:abstractNumId w:val="0"/>
   </w:num>
   <w:num w:numId="54" w16cid:durableId="899511743">
-    <w:abstractNumId w:val="63"/>
+    <w:abstractNumId w:val="65"/>
   </w:num>
   <w:num w:numId="55" w16cid:durableId="1778015197">
     <w:abstractNumId w:val="36"/>
   </w:num>
   <w:num w:numId="56" w16cid:durableId="26300705">
-    <w:abstractNumId w:val="62"/>
+    <w:abstractNumId w:val="64"/>
   </w:num>
   <w:num w:numId="57" w16cid:durableId="1309289877">
     <w:abstractNumId w:val="14"/>
   </w:num>
   <w:num w:numId="58" w16cid:durableId="1202940671">
-    <w:abstractNumId w:val="54"/>
+    <w:abstractNumId w:val="55"/>
   </w:num>
   <w:num w:numId="59" w16cid:durableId="446239584">
-    <w:abstractNumId w:val="59"/>
+    <w:abstractNumId w:val="61"/>
   </w:num>
   <w:num w:numId="60" w16cid:durableId="356350136">
     <w:abstractNumId w:val="10"/>
@@ -11846,7 +11953,7 @@
     <w:abstractNumId w:val="23"/>
   </w:num>
   <w:num w:numId="65" w16cid:durableId="2145346396">
-    <w:abstractNumId w:val="58"/>
+    <w:abstractNumId w:val="60"/>
   </w:num>
   <w:num w:numId="66" w16cid:durableId="1486315432">
     <w:abstractNumId w:val="16"/>
@@ -11856,6 +11963,12 @@
   </w:num>
   <w:num w:numId="68" w16cid:durableId="1149175788">
     <w:abstractNumId w:val="39"/>
+  </w:num>
+  <w:num w:numId="69" w16cid:durableId="2143034458">
+    <w:abstractNumId w:val="59"/>
+  </w:num>
+  <w:num w:numId="70" w16cid:durableId="1661927969">
+    <w:abstractNumId w:val="40"/>
   </w:num>
 </w:numbering>
 </file>
@@ -12456,6 +12569,7 @@
   <w:style w:type="character" w:default="1" w:styleId="Fuentedeprrafopredeter">
     <w:name w:val="Default Paragraph Font"/>
     <w:uiPriority w:val="1"/>
+    <w:semiHidden/>
     <w:unhideWhenUsed/>
   </w:style>
   <w:style w:type="table" w:default="1" w:styleId="Tablanormal">

</xml_diff>